<commit_message>
Formatting changes to privacy policy
</commit_message>
<xml_diff>
--- a/assets/Privacy Policy.docx
+++ b/assets/Privacy Policy.docx
@@ -49,7 +49,7 @@
           <w:rStyle w:val="text-token-text-primary"/>
           <w:rFonts w:asciiTheme="minorHAnsi" w:hAnsiTheme="minorHAnsi" w:cstheme="minorHAnsi"/>
         </w:rPr>
-        <w:t>[Insert Date]</w:t>
+        <w:t>11/03/2026</w:t>
       </w:r>
     </w:p>
     <w:p>
@@ -77,7 +77,21 @@
         <w:rPr>
           <w:rFonts w:asciiTheme="minorHAnsi" w:hAnsiTheme="minorHAnsi" w:cstheme="minorHAnsi"/>
         </w:rPr>
-        <w:t>This Privacy Policy explains how information is collected, used, stored, and shared when you or your child use the Pip and the Brain Explorers mobile application or associated website.</w:t>
+        <w:t xml:space="preserve">This Privacy Policy explains how information is collected, used, stored, and shared when you or your child </w:t>
+      </w:r>
+      <w:proofErr w:type="gramStart"/>
+      <w:r>
+        <w:rPr>
+          <w:rFonts w:asciiTheme="minorHAnsi" w:hAnsiTheme="minorHAnsi" w:cstheme="minorHAnsi"/>
+        </w:rPr>
+        <w:t>use</w:t>
+      </w:r>
+      <w:proofErr w:type="gramEnd"/>
+      <w:r>
+        <w:rPr>
+          <w:rFonts w:asciiTheme="minorHAnsi" w:hAnsiTheme="minorHAnsi" w:cstheme="minorHAnsi"/>
+        </w:rPr>
+        <w:t xml:space="preserve"> the Pip and the Brain Explorers mobile application or associated website.</w:t>
       </w:r>
     </w:p>
     <w:p>
@@ -446,7 +460,21 @@
         <w:rPr>
           <w:rFonts w:asciiTheme="minorHAnsi" w:hAnsiTheme="minorHAnsi" w:cstheme="minorHAnsi"/>
         </w:rPr>
-        <w:t>. The ID code is used so the research team can analyze results without identifying the child.</w:t>
+        <w:t xml:space="preserve">. The ID code is used so the research team can </w:t>
+      </w:r>
+      <w:proofErr w:type="spellStart"/>
+      <w:r>
+        <w:rPr>
+          <w:rFonts w:asciiTheme="minorHAnsi" w:hAnsiTheme="minorHAnsi" w:cstheme="minorHAnsi"/>
+        </w:rPr>
+        <w:t>analyze</w:t>
+      </w:r>
+      <w:proofErr w:type="spellEnd"/>
+      <w:r>
+        <w:rPr>
+          <w:rFonts w:asciiTheme="minorHAnsi" w:hAnsiTheme="minorHAnsi" w:cstheme="minorHAnsi"/>
+        </w:rPr>
+        <w:t xml:space="preserve"> results without identifying the child.</w:t>
       </w:r>
     </w:p>
     <w:p>
@@ -893,7 +921,21 @@
         <w:rPr>
           <w:rFonts w:asciiTheme="minorHAnsi" w:hAnsiTheme="minorHAnsi" w:cstheme="minorHAnsi"/>
         </w:rPr>
-        <w:t>We take reasonable technical and organisational measures to protect the information collected through the application. Research data is stored securely and access is restricted to authorised members of the research team.</w:t>
+        <w:t xml:space="preserve">We take reasonable technical and organisational measures to protect the information collected through the application. Research data is stored </w:t>
+      </w:r>
+      <w:proofErr w:type="gramStart"/>
+      <w:r>
+        <w:rPr>
+          <w:rFonts w:asciiTheme="minorHAnsi" w:hAnsiTheme="minorHAnsi" w:cstheme="minorHAnsi"/>
+        </w:rPr>
+        <w:t>securely</w:t>
+      </w:r>
+      <w:proofErr w:type="gramEnd"/>
+      <w:r>
+        <w:rPr>
+          <w:rFonts w:asciiTheme="minorHAnsi" w:hAnsiTheme="minorHAnsi" w:cstheme="minorHAnsi"/>
+        </w:rPr>
+        <w:t xml:space="preserve"> and access is restricted to authorised members of the research team.</w:t>
       </w:r>
     </w:p>
     <w:p>
@@ -1286,21 +1328,7 @@
             <w:rStyle w:val="Hyperlink"/>
             <w:rFonts w:asciiTheme="minorHAnsi" w:hAnsiTheme="minorHAnsi" w:cstheme="minorHAnsi"/>
           </w:rPr>
-          <w:t>pip.brainexplorers@kc</w:t>
-        </w:r>
-        <w:r>
-          <w:rPr>
-            <w:rStyle w:val="Hyperlink"/>
-            <w:rFonts w:asciiTheme="minorHAnsi" w:hAnsiTheme="minorHAnsi" w:cstheme="minorHAnsi"/>
-          </w:rPr>
-          <w:t>l</w:t>
-        </w:r>
-        <w:r>
-          <w:rPr>
-            <w:rStyle w:val="Hyperlink"/>
-            <w:rFonts w:asciiTheme="minorHAnsi" w:hAnsiTheme="minorHAnsi" w:cstheme="minorHAnsi"/>
-          </w:rPr>
-          <w:t>.ac.uk</w:t>
+          <w:t>pip.brainexplorers@kcl.ac.uk</w:t>
         </w:r>
       </w:hyperlink>
       <w:r>

</xml_diff>